<commit_message>
I-11 corregido: tablas por subgrupo regeneradas sin conteos pequeños reconstruibles
Decisión del autor (22-10-2026): regenerar las tablas.
- evaluacion/subgrupos.py combina los grupos pequeños («A o B») en vez de
  ocultarlos u omitirlos; el método anterior queda con agrupar_pequenos=False.
- regenerar_subgrupos.py rehízo las 4 tablas de la F5 (ensayo 2023 y
  evaluación 2024) con los modelos congelados y la guardia sin ajustes, después
  de comprobar que el método anterior reproduce byte a byte las publicadas.
  Huellas en salidas/tablas/regeneracion_subgrupos_I-11.csv.
- F6: subgrupo.csv rehecho desde las tablas nuevas y su huella actualizada.
- El escáner por propiedad no encuentra conteos reconstruibles; la lista de
  hallazgos declarados queda vacía.
- Las versiones anteriores siguen en el historial público (decisión de I-09).

Co-Authored-By: Claude Opus 5.5 <noreply@anthropic.com>
Claude-Session: https://claude.ai/code/session_0192aVCC8aocJbeAsVJ1Mter
</commit_message>
<xml_diff>
--- a/docs/defensa/Defensa_limitaciones_y_respuestas.docx
+++ b/docs/defensa/Defensa_limitaciones_y_respuestas.docx
@@ -4328,7 +4328,7 @@
                 <w:sz w:val="19"/>
                 <w:szCs w:val="19"/>
               </w:rPr>
-              <w:t xml:space="preserve">Decisión de publicación pendiente</w:t>
+              <w:t xml:space="preserve">I-11 corregido (tablas regeneradas); historial público pendiente (I-09)</w:t>
             </w:r>
           </w:p>
         </w:tc>
@@ -4647,7 +4647,7 @@
         <w:spacing w:after="80" w:line="264"/>
       </w:pPr>
       <w:r>
-        <w:t xml:space="preserve">hay conteos nacionales reconstruibles por complemento en las tablas por subgrupo (I-11).</w:t>
+        <w:t xml:space="preserve">había conteos nacionales reconstruibles por complemento en las tablas por subgrupo (I-11, corregido: los grupos pequeños ahora se combinan).</w:t>
       </w:r>
     </w:p>
     <w:p>
@@ -4655,7 +4655,7 @@
         <w:spacing w:after="120" w:line="276"/>
       </w:pPr>
       <w:r>
-        <w:t xml:space="preserve">El escáner nuevo intenta reconstruir conteos combinando tablas, y falla ante cualquier hallazgo no declarado. Los códigos de hospital no anonimizan: la protección es no rankear.</w:t>
+        <w:t xml:space="preserve">El escáner nuevo intenta reconstruir conteos combinando tablas, y hoy no encuentra ninguno en lo publicado. Los códigos de hospital no anonimizan: la protección es no rankear.</w:t>
       </w:r>
     </w:p>
     <w:p>

</xml_diff>

<commit_message>
Enmienda 02: resumen, anexo y lectura en la documentación
- salidas/enmienda_02/RESUMEN.md y docs/fase5_evaluacion/Anexo_Enmienda02_resultados.docx.
- README, índice de docs, guía F5 y gobernanza: enmienda 02 registrada y corrida.
- Defensa: limitaciones y respuestas 1, 11, 14 y 15 con la evidencia de la
  enmienda 02 (EX03, alta voluntaria, grupos DEIS, paliativos).

Co-Authored-By: Claude Opus 5.5 <noreply@anthropic.com>
Claude-Session: https://claude.ai/code/session_0192aVCC8aocJbeAsVJ1Mter
</commit_message>
<xml_diff>
--- a/docs/defensa/Defensa_limitaciones_y_respuestas.docx
+++ b/docs/defensa/Defensa_limitaciones_y_respuestas.docx
@@ -416,7 +416,7 @@
         <w:spacing w:after="120" w:line="276"/>
       </w:pPr>
       <w:r>
-        <w:t xml:space="preserve">Versión del 22-10-2026. Usa la evidencia de la enmienda 01, que se corrió una vez con el código registrado antes (</w:t>
+        <w:t xml:space="preserve">Versión del 22-10-2026. Usa la evidencia de las enmiendas 01 y 02, que se corrieron una vez cada una con el código registrado antes (</w:t>
       </w:r>
       <w:r>
         <w:rPr>
@@ -425,6 +425,17 @@
           <w:szCs w:val="19"/>
         </w:rPr>
         <w:t xml:space="preserve">docs/fase5_evaluacion/Anexo_Enmienda01_resultados.docx</w:t>
+      </w:r>
+      <w:r>
+        <w:t xml:space="preserve"> y </w:t>
+      </w:r>
+      <w:r>
+        <w:rPr>
+          <w:rFonts w:ascii="Consolas" w:cs="Consolas" w:eastAsia="Consolas" w:hAnsi="Consolas"/>
+          <w:sz w:val="19"/>
+          <w:szCs w:val="19"/>
+        </w:rPr>
+        <w:t xml:space="preserve">Anexo_Enmienda02_resultados.docx</w:t>
       </w:r>
       <w:r>
         <w:t xml:space="preserve">). Las cifras de 2024 son del diseño original, rotulado «ya abierto». Las de 2023 son del diseño anidado, que no usa 2024.</w:t>
@@ -1720,7 +1731,7 @@
                 <w:sz w:val="19"/>
                 <w:szCs w:val="19"/>
               </w:rPr>
-              <w:t xml:space="preserve">Enmienda 02, análisis E2.2 y E2.3 (pendiente de registrar)</w:t>
+              <w:t xml:space="preserve">Excluir el MDC 14 completo no cambia el indicador: en 2023 ningún hospital cambia de zona, en 2024 uno (E2.2). Salen 46 muertes obstétricas en 2019–2023. Se puede adoptar en una versión 2</w:t>
             </w:r>
           </w:p>
         </w:tc>
@@ -1857,7 +1868,7 @@
                 <w:sz w:val="19"/>
                 <w:szCs w:val="19"/>
               </w:rPr>
-              <w:t xml:space="preserve">Enmienda 02, análisis E2.1</w:t>
+              <w:t xml:space="preserve">Sacarlas no cambia el indicador: ningún hospital cambia de zona, ρ 0,998 (E2.1)</w:t>
             </w:r>
           </w:p>
         </w:tc>
@@ -3286,7 +3297,7 @@
                 <w:sz w:val="19"/>
                 <w:szCs w:val="19"/>
               </w:rPr>
-              <w:t xml:space="preserve">O/E 0,85–0,86 en el tercil de menos egresos; 0,79–0,83 en los hospitales con menos de 2 años en GRD (3.6). Con grupos de pares, los hospitales fuera bajan del 15,9 % al 5,8 % (3.1b)</w:t>
+              <w:t xml:space="preserve">O/E 0,85–0,86 en el tercil de menos egresos; 0,79–0,83 en los hospitales con menos de 2 años en GRD (3.6). Con grupos por volumen, los hospitales fuera bajan del 15,9 % al 5,8 % (3.1b); con grupos DEIS, solo al 11,6 % (E2.4a)</w:t>
             </w:r>
           </w:p>
         </w:tc>
@@ -3319,7 +3330,7 @@
                 <w:sz w:val="19"/>
                 <w:szCs w:val="19"/>
               </w:rPr>
-              <w:t xml:space="preserve">Presentar la estadía por grupo de pares o junto al volumen. Grupos DEIS en la enmienda 02 (E2.4)</w:t>
+              <w:t xml:space="preserve">Presentar la estadía por grupo de pares de volumen, o junto al volumen</w:t>
             </w:r>
           </w:p>
         </w:tc>
@@ -4427,7 +4438,7 @@
         <w:spacing w:after="120" w:line="276"/>
       </w:pPr>
       <w:r>
-        <w:t xml:space="preserve">Propongo leer la estadía por grupo de pares. La enmienda 02 agrega los grupos del catálogo DEIS.</w:t>
+        <w:t xml:space="preserve">Propongo leer la estadía por grupo de pares de volumen. Con los grupos de complejidad del DEIS (alta, mediana e institutos), los hospitales de estadía fuera de los límites solo bajan al 11,6 % (enmienda 02, E2.4a): el tamaño pesa más que la complejidad.</w:t>
       </w:r>
     </w:p>
     <w:p>
@@ -4593,7 +4604,7 @@
         <w:t xml:space="preserve">11. ¿Qué pasa con los pacientes derivados o enviados a hospitalización domiciliaria?</w:t>
       </w:r>
       <w:r>
-        <w:t xml:space="preserve"> Quedan censurados. Los hospitales con alerta baja de estadía derivan el doble que el resto (auditoría, H-06). La enmienda 02 informa, junto al O/E, la tasa de hospitalización domiciliaria y de alta voluntaria por hospital (E2.6a). La mortalidad a 30 días con el Registro Civil es trabajo futuro.</w:t>
+        <w:t xml:space="preserve"> Quedan censurados. Los hospitales con alerta baja de estadía derivan el doble que el resto (auditoría, H-06). La enmienda 02 publica, junto al O/E, la tasa de hospitalización domiciliaria y de alta voluntaria por hospital (E2.6a). Los hospitales con más altas a domicilio tienen un O/E de estadía algo más bajo (ρ −0,14 a −0,26). Sacar el alta voluntaria y la fuga de la estadía no cambia el indicador (E2.1). La mortalidad a 30 días con el Registro Civil es trabajo futuro.</w:t>
       </w:r>
     </w:p>
     <w:p>
@@ -4693,7 +4704,7 @@
         <w:t xml:space="preserve">14. ¿Quién validó clínicamente las reglas?</w:t>
       </w:r>
       <w:r>
-        <w:t xml:space="preserve"> Nadie todavía, y es una limitación. Las reglas se basan en literatura y datos. Para EX03 adopté la opción conservadora: excluir el MDC 14 completo, en la enmienda 02. Pedí revisión de la procedencia y del nivel de cuidado.</w:t>
+        <w:t xml:space="preserve"> Nadie todavía, y es una limitación. Las reglas se basan en literatura y datos. Para EX03 probé la opción conservadora, que excluye el MDC 14 completo, y el indicador no cambia: en 2023 ningún hospital cambia de zona y en 2024 uno solo (enmienda 02, E2.2). Pedí revisión de la procedencia y del nivel de cuidado.</w:t>
       </w:r>
     </w:p>
     <w:p>
@@ -4708,7 +4719,41 @@
         <w:t xml:space="preserve">15. ¿Qué pasa si un hospital codifica más paliativos (Z51.5)?</w:t>
       </w:r>
       <w:r>
-        <w:t xml:space="preserve"> Su esperado sube y su O/E baja. Cerca del 3 % de las muertes de 2019 a 2023 tiene Z51.5 en algún diagnóstico. La enmienda 02 informa la tasa de Z51.5 por hospital junto al O/E (E2.6a) y repite el O/E de mortalidad sin esos episodios (E2.6b).</w:t>
+        <w:t xml:space="preserve"> Su esperado sube y su O/E baja. Cerca del 3 % de las muertes de 2019 a 2023 tiene Z51.5 en algún diagnóstico. Lo medí en la enmienda 02:</w:t>
+      </w:r>
+    </w:p>
+    <w:p>
+      <w:pPr>
+        <w:pStyle w:val="ListParagraph"/>
+        <w:numPr>
+          <w:ilvl w:val="0"/>
+          <w:numId w:val="2"/>
+        </w:numPr>
+        <w:spacing w:after="80" w:line="264"/>
+      </w:pPr>
+      <w:r>
+        <w:t xml:space="preserve">la tasa de Z51.5 por hospital no se relaciona con el O/E (|ρ| de 0,02 o menos, E2.6a);</w:t>
+      </w:r>
+    </w:p>
+    <w:p>
+      <w:pPr>
+        <w:pStyle w:val="ListParagraph"/>
+        <w:numPr>
+          <w:ilvl w:val="0"/>
+          <w:numId w:val="2"/>
+        </w:numPr>
+        <w:spacing w:after="80" w:line="264"/>
+      </w:pPr>
+      <w:r>
+        <w:t xml:space="preserve">sin esos episodios, el indicador resiste: 96,9 y 95,7 % de los hospitales en la misma zona (E2.6b).</w:t>
+      </w:r>
+    </w:p>
+    <w:p>
+      <w:pPr>
+        <w:spacing w:after="120" w:line="276"/>
+      </w:pPr>
+      <w:r>
+        <w:t xml:space="preserve">Con estos datos no hay señal de que la codificación de paliativos explique las diferencias.</w:t>
       </w:r>
     </w:p>
     <w:p>
@@ -4735,7 +4780,18 @@
         <w:t xml:space="preserve">Hospitales.csv</w:t>
       </w:r>
       <w:r>
-        <w:t xml:space="preserve"> traía el nivel de complejidad. Solo trae código y nombre. Los informes v5 ya no lo afirman, y la Fase 1 v5 advierte que el archivo traduce los códigos a nombres. El nivel de complejidad saldrá del catálogo DEIS (enmienda 02, E2.4).</w:t>
+        <w:t xml:space="preserve"> traía el nivel de complejidad. Solo trae código y nombre. Los informes v5 ya no lo afirman, y la Fase 1 v5 advierte que el archivo traduce los códigos a nombres. El nivel de complejidad ahora sale del catálogo DEIS (</w:t>
+      </w:r>
+      <w:r>
+        <w:rPr>
+          <w:rFonts w:ascii="Consolas" w:cs="Consolas" w:eastAsia="Consolas" w:hAnsi="Consolas"/>
+          <w:sz w:val="19"/>
+          <w:szCs w:val="19"/>
+        </w:rPr>
+        <w:t xml:space="preserve">fase3_preparacion/config/tipo_establecimiento.csv</w:t>
+      </w:r>
+      <w:r>
+        <w:t xml:space="preserve">): 52 hospitales generales de alta complejidad, 14 de mediana, 3 institutos y 3 pediátricos.</w:t>
       </w:r>
     </w:p>
     <w:sectPr>

</xml_diff>